<commit_message>
fix(mobile): corrigir navegação dos slides em celular com height:100dvh
- Substitui height:100vh por height:100dvh em 14 arquivos de slide
  para que o botão de navegação (Próximo/Anterior) apareça corretamente
  no mobile quando a barra de endereços do browser está visível
- Adiciona CSS @media(max-width:640px) com padding e fontes menores
  para melhor leitura dos slides no celular
- Adiciona CSS mobile responsivo em uc.html (header, container, cards)

Co-Authored-By: Claude Sonnet 4.6 <noreply@anthropic.com>
</commit_message>
<xml_diff>
--- a/sistema/INTRODUCAO_A_TECNOLOGIA_DA_INFORMACAO_E_COMUNICACAO/AVALIACOES_CRIADAS/PROVA_OBJETIVA_UC1_TIC.docx
+++ b/sistema/INTRODUCAO_A_TECNOLOGIA_DA_INFORMACAO_E_COMUNICACAO/AVALIACOES_CRIADAS/PROVA_OBJETIVA_UC1_TIC.docx
@@ -321,7 +321,25 @@
                 <w:sz w:val="20"/>
                 <w:szCs w:val="20"/>
               </w:rPr>
-              <w:t>Estudante:</w:t>
+              <w:t>Estudante</w:t>
+            </w:r>
+            <w:r>
+              <w:rPr>
+                <w:b/>
+                <w:bCs/>
+                <w:sz w:val="20"/>
+                <w:szCs w:val="20"/>
+              </w:rPr>
+              <w:t>s</w:t>
+            </w:r>
+            <w:r>
+              <w:rPr>
+                <w:b/>
+                <w:bCs/>
+                <w:sz w:val="20"/>
+                <w:szCs w:val="20"/>
+              </w:rPr>
+              <w:t>:</w:t>
             </w:r>
           </w:p>
         </w:tc>
@@ -1032,27 +1050,16 @@
         <w:spacing w:before="60" w:after="80"/>
       </w:pPr>
       <w:r>
-        <w:t xml:space="preserve">      </w:t>
-      </w:r>
-      <w:r>
-        <w:t>a) Adware.</w:t>
-      </w:r>
-    </w:p>
-    <w:p>
-      <w:pPr>
-        <w:spacing w:before="40" w:after="40"/>
-        <w:ind w:left="400"/>
-      </w:pPr>
-      <w:r>
-        <w:t xml:space="preserve">b) </w:t>
-      </w:r>
-      <w:proofErr w:type="spellStart"/>
-      <w:r>
-        <w:t>Ransomware</w:t>
-      </w:r>
-      <w:proofErr w:type="spellEnd"/>
-      <w:r>
-        <w:t>.</w:t>
+        <w:t xml:space="preserve">      a) Adware.</w:t>
+      </w:r>
+    </w:p>
+    <w:p>
+      <w:pPr>
+        <w:spacing w:before="40" w:after="40"/>
+        <w:ind w:left="400"/>
+      </w:pPr>
+      <w:r>
+        <w:t>b) Ransomware.</w:t>
       </w:r>
     </w:p>
     <w:p>

</xml_diff>